<commit_message>
Bind manual refresh to Left Pan + Right Pan
script_refresh was left without a default gesture in the keymap
unification, so QA found no way to refresh the cells. It is bound to
panLeft+panRight again and does nothing on D3 hardware (Dot Pad X),
which refreshes in hardware.

Graphic mode keeps the chord for recenter and now refreshes as well. The
library exposes no viewport state, so there is no telling whether the
view was already centered; refreshing every time costs little, since a
queued refresh packet is dropped for any row the recentered frame
rewrites.

Claude-Session: https://claude.ai/code/session_01PHEymauRqqifYogSdn2jCh
</commit_message>
<xml_diff>
--- a/docs/wordSource/NVDA Dot Pad Add-on Guide.docx
+++ b/docs/wordSource/NVDA Dot Pad Add-on Guide.docx
@@ -2726,6 +2726,25 @@
     </w:p>
     <w:p>
       <w:pPr>
+        <w:numPr>
+          <w:ilvl w:val="0"/>
+          <w:numId w:val="8"/>
+        </w:numPr>
+        <w:rPr>
+          <w:rFonts w:ascii="Arial" w:hAnsi="Arial"/>
+          <w:lang w:val="en-US"/>
+        </w:rPr>
+      </w:pPr>
+      <w:r>
+        <w:rPr>
+          <w:rFonts w:ascii="Arial" w:hAnsi="Arial"/>
+          <w:lang w:val="en-US"/>
+        </w:rPr>
+        <w:t>Left Pan + Right Pan: Refresh the display, to restore dots that did not raise or lower correctly. When showing a tactile image, this also recenters the image. The Dot Pad X refreshes by itself, so there this does nothing outside tactile graphics mode.</w:t>
+      </w:r>
+    </w:p>
+    <w:p>
+      <w:pPr>
         <w:rPr>
           <w:rFonts w:ascii="Arial" w:hAnsi="Arial"/>
           <w:lang w:val="en-US"/>
@@ -4410,7 +4429,7 @@
           <w:bCs/>
           <w:lang w:val="en-US"/>
         </w:rPr>
-        <w:t>Left Pan + Right Pan Keys, pressed simultaneously: Reset the tactile graphics view back to the default, centered presentation.</w:t>
+        <w:t>Left Pan + Right Pan Keys, pressed simultaneously: Reset the tactile graphics view back to the default, centered presentation. On the Dot Pad 320A this also refreshes the display.</w:t>
       </w:r>
     </w:p>
     <w:p>

</xml_diff>